<commit_message>
Preserve source formatting in generate subs
</commit_message>
<xml_diff>
--- a/templates/subs_template.docx
+++ b/templates/subs_template.docx
@@ -4,23 +4,6 @@
   <w:body>
     <w:p>
       <w:r>
-        <w:t>{{TITLE}}</w:t>
-      </w:r>
-    </w:p>
-    <w:p>
-      <w:r>
-        <w:t>{{URL}}</w:t>
-      </w:r>
-    </w:p>
-    <w:p/>
-    <w:p>
-      <w:r>
-        <w:t>{{SUMMARY}}</w:t>
-      </w:r>
-    </w:p>
-    <w:p/>
-    <w:p>
-      <w:r>
         <w:rPr>
           <w:rStyle w:val="SectionLabel"/>
         </w:rPr>
@@ -81,17 +64,6 @@
           <w:rStyle w:val="SectionLabel"/>
         </w:rPr>
         <w:t>字幕：</w:t>
-      </w:r>
-    </w:p>
-    <w:p>
-      <w:r>
-        <w:t>{{TIMING}}</w:t>
-      </w:r>
-    </w:p>
-    <w:p/>
-    <w:p>
-      <w:r>
-        <w:t>{{BODY}}</w:t>
       </w:r>
     </w:p>
     <w:sectPr>

</xml_diff>